<commit_message>
Add logo, upscale links, patent info; keep private certificates out of repo
Co-Authored-By: Claude Opus 5.5 <noreply@anthropic.com>
Claude-Session: https://claude.ai/code/session_01Q9jKbqwfC2QY6shEfWUhSP
</commit_message>
<xml_diff>
--- a/히즈빈스_상세페이지_회신자료/00_상세페이지_최종안_컨셉3.docx
+++ b/히즈빈스_상세페이지_회신자료/00_상세페이지_최종안_컨셉3.docx
@@ -4939,7 +4939,7 @@
         <w:rPr>
           <w:lang w:eastAsia="ko-KR"/>
         </w:rPr>
-        <w:t>원두 속까지 100% 익히는 웰던 로스팅 ('단맛 중심의 커피' 특허)</w:t>
+        <w:t>원두 속까지 100% 익히는 웰던 로스팅 — 특허 제10-2144655호 「단맛을 강화시킨 커피 제조방법」</w:t>
       </w:r>
       <w:r>
         <w:rPr>
@@ -5677,7 +5677,7 @@
         <w:rPr>
           <w:lang w:eastAsia="ko-KR"/>
         </w:rPr>
-        <w:t>특허: PDF상 특허는 '단맛 중심의 커피'(웰던 로스팅) 관련 — 바이패스 추출 특허로 표기하지 않음. 번호 확인 필요</w:t>
+        <w:t>특허: 특허증 제10-2144655호(2020.08.08 등록) 「단맛을 강화시킨 커피 제조방법」, 특허권자 (주)향기내는사람들 — 바이패스 추출 특허로 표기하지 않음</w:t>
       </w:r>
       <w:r>
         <w:rPr>
@@ -12162,7 +12162,7 @@
         <w:rPr>
           <w:lang w:eastAsia="ko-KR"/>
         </w:rPr>
-        <w:t>PDF상 특허는 "단맛 중심의 커피"(웰던 로스팅) — 바이패스 추출이 특허라는 근거 없음</w:t>
+        <w:t>[해결] 특허증 확보: 제10-2144655호 「단맛을 강화시킨 커피 제조방법」 — 바이패스 추출 특허 근거는 없음</w:t>
       </w:r>
       <w:r>
         <w:rPr>
@@ -12260,7 +12260,7 @@
         <w:rPr>
           <w:lang w:eastAsia="ko-KR"/>
         </w:rPr>
-        <w:t>→ 특허 표현은 웰던 로스팅에만 사용하고, 특허증 사본을 인스브룩크에 함께 전달 (특허 표현은 증빙 필요).</w:t>
+        <w:t>→ 특허 표현은 '단맛 강화 커피 제조방법'(웰던 로스팅)에만 사용. 특허증 사본 첨부(발명자 개인 주소는 가림 처리).</w:t>
       </w:r>
       <w:r>
         <w:rPr>
@@ -12519,91 +12519,77 @@
         <w:rPr>
           <w:lang w:eastAsia="ko-KR"/>
         </w:rPr>
-        <w:t xml:space="preserve">→ </w:t>
-      </w:r>
-      <w:r>
-        <w:rPr>
-          <w:lang w:eastAsia="ko-KR"/>
-        </w:rPr>
-        <w:t>원본</w:t>
-      </w:r>
-      <w:r>
-        <w:rPr>
-          <w:lang w:eastAsia="ko-KR"/>
-        </w:rPr>
-        <w:t xml:space="preserve"> </w:t>
-      </w:r>
-      <w:r>
-        <w:rPr>
-          <w:lang w:eastAsia="ko-KR"/>
-        </w:rPr>
-        <w:t>파일</w:t>
-      </w:r>
-      <w:r>
-        <w:rPr>
-          <w:lang w:eastAsia="ko-KR"/>
-        </w:rPr>
-        <w:t xml:space="preserve"> </w:t>
-      </w:r>
-      <w:r>
-        <w:rPr>
-          <w:lang w:eastAsia="ko-KR"/>
-        </w:rPr>
-        <w:t>확보</w:t>
-      </w:r>
-      <w:r>
-        <w:rPr>
-          <w:lang w:eastAsia="ko-KR"/>
-        </w:rPr>
-        <w:t xml:space="preserve"> </w:t>
-      </w:r>
-      <w:r>
-        <w:rPr>
-          <w:lang w:eastAsia="ko-KR"/>
-        </w:rPr>
-        <w:t>시</w:t>
-      </w:r>
-      <w:r>
-        <w:rPr>
-          <w:lang w:eastAsia="ko-KR"/>
-        </w:rPr>
-        <w:t xml:space="preserve"> </w:t>
-      </w:r>
-      <w:r>
-        <w:rPr>
-          <w:lang w:eastAsia="ko-KR"/>
-        </w:rPr>
-        <w:t>신뢰도</w:t>
-      </w:r>
-      <w:r>
-        <w:rPr>
-          <w:lang w:eastAsia="ko-KR"/>
-        </w:rPr>
-        <w:t xml:space="preserve"> </w:t>
-      </w:r>
-      <w:r>
-        <w:rPr>
-          <w:lang w:eastAsia="ko-KR"/>
-        </w:rPr>
-        <w:t>강화</w:t>
-      </w:r>
-      <w:r>
-        <w:rPr>
-          <w:lang w:eastAsia="ko-KR"/>
-        </w:rPr>
-        <w:t xml:space="preserve"> </w:t>
-      </w:r>
-      <w:r>
-        <w:rPr>
-          <w:lang w:eastAsia="ko-KR"/>
-        </w:rPr>
-        <w:t>가능</w:t>
-      </w:r>
-      <w:r>
-        <w:rPr>
-          <w:lang w:eastAsia="ko-KR"/>
-        </w:rPr>
-        <w:t>.</w:t>
+        <w:t>→ 받은 시험성적서 3건(게이샤블랜드 2014053307165 / 히즈빈스원두(케냐) 2014053307130 / 콜드브루 시그니처 2015032078519)은 모두 이 제품(품목보고번호 2015032078573)이 아님 → 상세페이지 증빙으로 사용 불가. 이 제품 성적서(R20201029-0031 또는 최신본) 별도 확보 필요.</w:t>
+      </w:r>
+      <w:r>
+        <w:rPr>
+          <w:lang w:eastAsia="ko-KR"/>
+        </w:rPr>
+      </w:r>
+      <w:r>
+        <w:rPr>
+          <w:lang w:eastAsia="ko-KR"/>
+        </w:rPr>
+      </w:r>
+      <w:r>
+        <w:rPr>
+          <w:lang w:eastAsia="ko-KR"/>
+        </w:rPr>
+      </w:r>
+      <w:r>
+        <w:rPr>
+          <w:lang w:eastAsia="ko-KR"/>
+        </w:rPr>
+      </w:r>
+      <w:r>
+        <w:rPr>
+          <w:lang w:eastAsia="ko-KR"/>
+        </w:rPr>
+      </w:r>
+      <w:r>
+        <w:rPr>
+          <w:lang w:eastAsia="ko-KR"/>
+        </w:rPr>
+      </w:r>
+      <w:r>
+        <w:rPr>
+          <w:lang w:eastAsia="ko-KR"/>
+        </w:rPr>
+      </w:r>
+      <w:r>
+        <w:rPr>
+          <w:lang w:eastAsia="ko-KR"/>
+        </w:rPr>
+      </w:r>
+      <w:r>
+        <w:rPr>
+          <w:lang w:eastAsia="ko-KR"/>
+        </w:rPr>
+      </w:r>
+      <w:r>
+        <w:rPr>
+          <w:lang w:eastAsia="ko-KR"/>
+        </w:rPr>
+      </w:r>
+      <w:r>
+        <w:rPr>
+          <w:lang w:eastAsia="ko-KR"/>
+        </w:rPr>
+      </w:r>
+      <w:r>
+        <w:rPr>
+          <w:lang w:eastAsia="ko-KR"/>
+        </w:rPr>
+      </w:r>
+      <w:r>
+        <w:rPr>
+          <w:lang w:eastAsia="ko-KR"/>
+        </w:rPr>
+      </w:r>
+      <w:r>
+        <w:rPr>
+          <w:lang w:eastAsia="ko-KR"/>
+        </w:rPr>
       </w:r>
     </w:p>
     <w:p>

</xml_diff>

<commit_message>
Add brand story section and reply email draft
Co-Authored-By: Claude Opus 5.5 <noreply@anthropic.com>
Claude-Session: https://claude.ai/code/session_01Q9jKbqwfC2QY6shEfWUhSP
</commit_message>
<xml_diff>
--- a/히즈빈스_상세페이지_회신자료/00_상세페이지_최종안_컨셉3.docx
+++ b/히즈빈스_상세페이지_회신자료/00_상세페이지_최종안_컨셉3.docx
@@ -8424,39 +8424,235 @@
     <w:p>
       <w:pPr>
         <w:pStyle w:val="1"/>
-        <w:rPr>
-          <w:lang w:eastAsia="ko-KR"/>
-        </w:rPr>
-      </w:pPr>
-      <w:r>
-        <w:rPr>
-          <w:lang w:eastAsia="ko-KR"/>
-        </w:rPr>
-        <w:t xml:space="preserve">07. </w:t>
-      </w:r>
-      <w:r>
-        <w:rPr>
-          <w:lang w:eastAsia="ko-KR"/>
-        </w:rPr>
-        <w:t>상품</w:t>
-      </w:r>
-      <w:r>
-        <w:rPr>
-          <w:lang w:eastAsia="ko-KR"/>
-        </w:rPr>
-        <w:t xml:space="preserve"> </w:t>
-      </w:r>
-      <w:r>
-        <w:rPr>
-          <w:lang w:eastAsia="ko-KR"/>
-        </w:rPr>
-        <w:t>정보</w:t>
-      </w:r>
-      <w:r>
-        <w:rPr>
-          <w:lang w:eastAsia="ko-KR"/>
-        </w:rPr>
-        <w:t xml:space="preserve"> &amp; FAQ</w:t>
+      </w:pPr>
+      <w:r>
+        <w:t>07. 브랜드 스토리 — HISBEANS</w:t>
+      </w:r>
+    </w:p>
+    <w:p>
+      <w:pPr>
+        <w:pStyle w:val="21"/>
+      </w:pPr>
+      <w:r>
+        <w:t>[헤드라인]</w:t>
+      </w:r>
+    </w:p>
+    <w:p>
+      <w:pPr/>
+      <w:r>
+        <w:t>커피 한 잔으로 세상을 바꾸는</w:t>
+      </w:r>
+    </w:p>
+    <w:p>
+      <w:pPr/>
+      <w:r>
+        <w:t>World Changing Coffee, HISBEANS</w:t>
+      </w:r>
+    </w:p>
+    <w:p>
+      <w:pPr>
+        <w:pStyle w:val="21"/>
+      </w:pPr>
+      <w:r>
+        <w:t>[본문 카피]</w:t>
+      </w:r>
+    </w:p>
+    <w:p>
+      <w:pPr/>
+      <w:r>
+        <w:t>포항 한동대학교 중앙도서관의 작은 카페에서 시작했습니다. 【연도 확인: 2009년】</w:t>
+      </w:r>
+    </w:p>
+    <w:p>
+      <w:pPr/>
+      <w:r>
+        <w:t>히즈빈스는 정신장애인이 바리스타로 일하며 자립할 수 있는 일터를 만드는 사회적기업, (주)향기내는사람들의 커피 브랜드입니다.</w:t>
+      </w:r>
+    </w:p>
+    <w:p>
+      <w:pPr/>
+      <w:r>
+        <w:t>의사·사회복지사·매니저 등 여러 전문가가 함께하는 고용 모델로, 히즈빈스의 바리스타들은 장애인이 아닌 '커피 전문가'로 일합니다.</w:t>
+      </w:r>
+    </w:p>
+    <w:p>
+      <w:pPr/>
+      <w:r>
+        <w:t>그리고 맛으로 증명합니다. 직접 개발한 「단맛을 강화시킨 커피 제조방법」 특허(제10-2144655호)로, 원두 속까지 익히는 웰던 로스팅을 통해 단맛 중심의 커피를 만듭니다.</w:t>
+      </w:r>
+    </w:p>
+    <w:p>
+      <w:pPr/>
+      <w:r>
+        <w:t>게이샤 콜드브루 한 팩에 좋은 커피와, 함께 일하는 사람들의 이야기를 담았습니다.</w:t>
+      </w:r>
+    </w:p>
+    <w:p>
+      <w:pPr>
+        <w:pStyle w:val="21"/>
+      </w:pPr>
+      <w:r>
+        <w:t>[핵심 수치 — 회사 최신 공식 수치로 기입]</w:t>
+      </w:r>
+    </w:p>
+    <w:p>
+      <w:pPr/>
+      <w:r>
+        <w:t>함께 일하는 바리스타 ○○명  |  근속률 ○○%  |  매장·고객사 ○○곳</w:t>
+      </w:r>
+    </w:p>
+    <w:p>
+      <w:pPr>
+        <w:pStyle w:val="21"/>
+      </w:pPr>
+      <w:r>
+        <w:t>[이미지·그래픽 지시]</w:t>
+      </w:r>
+    </w:p>
+    <w:p>
+      <w:pPr>
+        <w:pStyle w:val="a0"/>
+      </w:pPr>
+      <w:r>
+        <w:t>배경: 딥그린(#22442A) — 앞뒤 섹션과 이어지는 컨셉3 톤 유지. 높이 약 1,200~1,500px.</w:t>
+      </w:r>
+    </w:p>
+    <w:p>
+      <w:pPr>
+        <w:pStyle w:val="a0"/>
+      </w:pPr>
+      <w:r>
+        <w:t>상단: HISBEANS 로고(01_브랜드/HISBEANS_로고_원본.png) + 슬로건 "World Changing Coffee".</w:t>
+      </w:r>
+    </w:p>
+    <w:p>
+      <w:pPr>
+        <w:pStyle w:val="a0"/>
+      </w:pPr>
+      <w:r>
+        <w:t>중단: 3단 타임라인 — 한동대 1호 카페에서 시작 / 2020 특허 등록 / 현재 전국 매장·원두 브랜드.</w:t>
+      </w:r>
+    </w:p>
+    <w:p>
+      <w:pPr>
+        <w:pStyle w:val="a0"/>
+      </w:pPr>
+      <w:r>
+        <w:t>하단: 핵심 수치 3개 카운터 아이콘 + 특허증 썸네일(02_인증_증빙).</w:t>
+      </w:r>
+    </w:p>
+    <w:p>
+      <w:pPr>
+        <w:pStyle w:val="a0"/>
+      </w:pPr>
+      <w:r>
+        <w:t>사진: 매장에서 일하는 바리스타·로스팅 장면(초상권·공개 동의 받은 사진만 사용, 뒷모습·손 클로즈업 가능).</w:t>
+      </w:r>
+    </w:p>
+    <w:p>
+      <w:pPr>
+        <w:pStyle w:val="a0"/>
+      </w:pPr>
+      <w:r>
+        <w:t>톤 가이드: 동정·시혜적 표현("도와주세요", "불쌍한" 등) 금지. "커피 전문가", "함께 일하는", "맛으로 증명" 관점 유지.</w:t>
+      </w:r>
+    </w:p>
+    <w:p>
+      <w:pPr>
+        <w:pStyle w:val="21"/>
+      </w:pPr>
+      <w:r>
+        <w:t>[표기 근거]</w:t>
+      </w:r>
+    </w:p>
+    <w:p>
+      <w:pPr>
+        <w:pStyle w:val="a0"/>
+      </w:pPr>
+      <w:r>
+        <w:t>한동대 중앙도서관 카페에서 시작, 정신장애인 고용 모델(1명을 전문가 7인이 지원), 대표 임정택·이민복: 더나은미래(조선일보) 보도 — 회사 공식 소개자료로 재확인</w:t>
+      </w:r>
+    </w:p>
+    <w:p>
+      <w:pPr>
+        <w:pStyle w:val="a0"/>
+      </w:pPr>
+      <w:r>
+        <w:t>특허: 특허증 제10-2144655호 (2018.12.07 출원, 2020.08.08 등록, 발명자 임정택, 특허권자 (주)향기내는사람들)</w:t>
+      </w:r>
+    </w:p>
+    <w:p>
+      <w:pPr>
+        <w:pStyle w:val="a0"/>
+      </w:pPr>
+      <w:r>
+        <w:t>슬로건 World Changing Coffee: 공식몰 표기</w:t>
+      </w:r>
+    </w:p>
+    <w:p>
+      <w:pPr>
+        <w:pStyle w:val="21"/>
+      </w:pPr>
+      <w:r>
+        <w:t>[확인 필요]</w:t>
+      </w:r>
+    </w:p>
+    <w:p>
+      <w:pPr>
+        <w:pStyle w:val="a0"/>
+      </w:pPr>
+      <w:r>
+        <w:t>언론 보도 수치(장애인 바리스타 비율 54%, 근속률 90%, 3개월 유지율 95%, 고객사 재계약률 96% 등)는 기사마다 기준·시점이 달라 그대로 쓰지 않음 → 회사 최신 공식 수치로 대체</w:t>
+      </w:r>
+    </w:p>
+    <w:p>
+      <w:pPr>
+        <w:pStyle w:val="a0"/>
+      </w:pPr>
+      <w:r>
+        <w:t>창업 연도(2009), 현재 매장 수·고객사 수, 사회적기업 인증 여부·인증번호</w:t>
+      </w:r>
+    </w:p>
+    <w:p>
+      <w:pPr>
+        <w:pStyle w:val="a0"/>
+      </w:pPr>
+      <w:r>
+        <w:t>바리스타 사진 사용 시 본인 초상권 및 장애 관련 정보 공개 동의</w:t>
+      </w:r>
+    </w:p>
+    <w:p>
+      <w:pPr>
+        <w:pStyle w:val="1"/>
+        <w:rPr>
+          <w:lang w:eastAsia="ko-KR"/>
+        </w:rPr>
+      </w:pPr>
+      <w:r>
+        <w:rPr>
+          <w:lang w:eastAsia="ko-KR"/>
+        </w:rPr>
+        <w:t>08. 상품 정보 &amp; FAQ</w:t>
+      </w:r>
+      <w:r>
+        <w:rPr>
+          <w:lang w:eastAsia="ko-KR"/>
+        </w:rPr>
+      </w:r>
+      <w:r>
+        <w:rPr>
+          <w:lang w:eastAsia="ko-KR"/>
+        </w:rPr>
+      </w:r>
+      <w:r>
+        <w:rPr>
+          <w:lang w:eastAsia="ko-KR"/>
+        </w:rPr>
+      </w:r>
+      <w:r>
+        <w:rPr>
+          <w:lang w:eastAsia="ko-KR"/>
+        </w:rPr>
       </w:r>
     </w:p>
     <w:p>
@@ -13227,85 +13423,72 @@
         <w:rPr>
           <w:lang w:eastAsia="ko-KR"/>
         </w:rPr>
-        <w:t>총</w:t>
-      </w:r>
-      <w:r>
-        <w:rPr>
-          <w:lang w:eastAsia="ko-KR"/>
-        </w:rPr>
-        <w:t xml:space="preserve"> </w:t>
-      </w:r>
-      <w:r>
-        <w:rPr>
-          <w:lang w:eastAsia="ko-KR"/>
-        </w:rPr>
-        <w:t>예상</w:t>
-      </w:r>
-      <w:r>
-        <w:rPr>
-          <w:lang w:eastAsia="ko-KR"/>
-        </w:rPr>
-        <w:t xml:space="preserve"> </w:t>
-      </w:r>
-      <w:r>
-        <w:rPr>
-          <w:lang w:eastAsia="ko-KR"/>
-        </w:rPr>
-        <w:t>세로</w:t>
-      </w:r>
-      <w:r>
-        <w:rPr>
-          <w:lang w:eastAsia="ko-KR"/>
-        </w:rPr>
-        <w:t xml:space="preserve"> </w:t>
-      </w:r>
-      <w:r>
-        <w:rPr>
-          <w:lang w:eastAsia="ko-KR"/>
-        </w:rPr>
-        <w:t>길이</w:t>
-      </w:r>
-      <w:r>
-        <w:rPr>
-          <w:lang w:eastAsia="ko-KR"/>
-        </w:rPr>
-        <w:t xml:space="preserve">: </w:t>
-      </w:r>
-      <w:r>
-        <w:rPr>
-          <w:lang w:eastAsia="ko-KR"/>
-        </w:rPr>
-        <w:t>약</w:t>
-      </w:r>
-      <w:r>
-        <w:rPr>
-          <w:lang w:eastAsia="ko-KR"/>
-        </w:rPr>
-        <w:t xml:space="preserve"> 12,000~14,000px (15,000px </w:t>
-      </w:r>
-      <w:r>
-        <w:rPr>
-          <w:lang w:eastAsia="ko-KR"/>
-        </w:rPr>
-        <w:t>이내</w:t>
-      </w:r>
-      <w:r>
-        <w:rPr>
-          <w:lang w:eastAsia="ko-KR"/>
-        </w:rPr>
-        <w:t xml:space="preserve"> </w:t>
-      </w:r>
-      <w:r>
-        <w:rPr>
-          <w:lang w:eastAsia="ko-KR"/>
-        </w:rPr>
-        <w:t>준수</w:t>
-      </w:r>
-      <w:r>
-        <w:rPr>
-          <w:lang w:eastAsia="ko-KR"/>
-        </w:rPr>
-        <w:t>)</w:t>
+        <w:t>총 예상 세로 길이: 약 13,500~15,000px — 브랜드 스토리 추가로 여유가 적음. 초과 시 06 페르소나 카드 4→3개, 03 원두 스토리 지도 일러스트 생략으로 축약 (15,000px 이내 준수)</w:t>
+      </w:r>
+      <w:r>
+        <w:rPr>
+          <w:lang w:eastAsia="ko-KR"/>
+        </w:rPr>
+      </w:r>
+      <w:r>
+        <w:rPr>
+          <w:lang w:eastAsia="ko-KR"/>
+        </w:rPr>
+      </w:r>
+      <w:r>
+        <w:rPr>
+          <w:lang w:eastAsia="ko-KR"/>
+        </w:rPr>
+      </w:r>
+      <w:r>
+        <w:rPr>
+          <w:lang w:eastAsia="ko-KR"/>
+        </w:rPr>
+      </w:r>
+      <w:r>
+        <w:rPr>
+          <w:lang w:eastAsia="ko-KR"/>
+        </w:rPr>
+      </w:r>
+      <w:r>
+        <w:rPr>
+          <w:lang w:eastAsia="ko-KR"/>
+        </w:rPr>
+      </w:r>
+      <w:r>
+        <w:rPr>
+          <w:lang w:eastAsia="ko-KR"/>
+        </w:rPr>
+      </w:r>
+      <w:r>
+        <w:rPr>
+          <w:lang w:eastAsia="ko-KR"/>
+        </w:rPr>
+      </w:r>
+      <w:r>
+        <w:rPr>
+          <w:lang w:eastAsia="ko-KR"/>
+        </w:rPr>
+      </w:r>
+      <w:r>
+        <w:rPr>
+          <w:lang w:eastAsia="ko-KR"/>
+        </w:rPr>
+      </w:r>
+      <w:r>
+        <w:rPr>
+          <w:lang w:eastAsia="ko-KR"/>
+        </w:rPr>
+      </w:r>
+      <w:r>
+        <w:rPr>
+          <w:lang w:eastAsia="ko-KR"/>
+        </w:rPr>
+      </w:r>
+      <w:r>
+        <w:rPr>
+          <w:lang w:eastAsia="ko-KR"/>
+        </w:rPr>
       </w:r>
     </w:p>
     <w:sectPr>

</xml_diff>